<commit_message>
docs: add trademark and non-affiliation notice
</commit_message>
<xml_diff>
--- a/app/docs/Nutanix_STIG_Hardening_Client_Execution_Guide.docx
+++ b/app/docs/Nutanix_STIG_Hardening_Client_Execution_Guide.docx
@@ -2,6 +2,224 @@
 <file path=word/document.xml><?xml version="1.0" encoding="utf-8"?>
 <w:document xmlns:wpc="http://schemas.microsoft.com/office/word/2010/wordprocessingCanvas" xmlns:mo="http://schemas.microsoft.com/office/mac/office/2008/main" xmlns:mc="http://schemas.openxmlformats.org/markup-compatibility/2006" xmlns:mv="urn:schemas-microsoft-com:mac:vml" xmlns:o="urn:schemas-microsoft-com:office:office" xmlns:r="http://schemas.openxmlformats.org/officeDocument/2006/relationships" xmlns:m="http://schemas.openxmlformats.org/officeDocument/2006/math" xmlns:v="urn:schemas-microsoft-com:vml" xmlns:wp14="http://schemas.microsoft.com/office/word/2010/wordprocessingDrawing" xmlns:wp="http://schemas.openxmlformats.org/drawingml/2006/wordprocessingDrawing" xmlns:w10="urn:schemas-microsoft-com:office:word" xmlns:w="http://schemas.openxmlformats.org/wordprocessingml/2006/main" xmlns:w14="http://schemas.microsoft.com/office/word/2010/wordml" xmlns:wpg="http://schemas.microsoft.com/office/word/2010/wordprocessingGroup" xmlns:wpi="http://schemas.microsoft.com/office/word/2010/wordprocessingInk" xmlns:wne="http://schemas.microsoft.com/office/word/2006/wordml" xmlns:wps="http://schemas.microsoft.com/office/word/2010/wordprocessingShape" mc:Ignorable="w14 wp14">
   <w:body>
+    <w:p>
+      <w:pPr>
+        <w:spacing w:before="280" w:after="40"/>
+      </w:pPr>
+      <w:r>
+        <w:rPr>
+          <w:rFonts w:ascii="Calibri" w:hAnsi="Calibri"/>
+          <w:b/>
+          <w:color w:val="2E74B5"/>
+          <w:sz w:val="20"/>
+        </w:rPr>
+        <w:t>NOTICE</w:t>
+      </w:r>
+    </w:p>
+    <w:p>
+      <w:pPr>
+        <w:spacing w:before="0" w:after="320"/>
+      </w:pPr>
+      <w:r>
+        <w:rPr>
+          <w:rFonts w:ascii="Calibri" w:hAnsi="Calibri"/>
+          <w:b/>
+          <w:color w:val="0B2545"/>
+          <w:sz w:val="50"/>
+        </w:rPr>
+        <w:t>Trademark and non-affiliation</w:t>
+      </w:r>
+    </w:p>
+    <w:p>
+      <w:pPr>
+        <w:spacing w:before="0" w:after="160" w:line="259" w:lineRule="auto"/>
+      </w:pPr>
+      <w:r>
+        <w:rPr>
+          <w:rFonts w:ascii="Calibri" w:hAnsi="Calibri"/>
+          <w:b w:val="0"/>
+          <w:color w:val="000000"/>
+          <w:sz w:val="21"/>
+        </w:rPr>
+        <w:t xml:space="preserve">Nutanix STIG Control Center is an independent, community-maintained project. It is </w:t>
+      </w:r>
+      <w:r>
+        <w:rPr>
+          <w:rFonts w:ascii="Calibri" w:hAnsi="Calibri"/>
+          <w:b/>
+          <w:color w:val="000000"/>
+          <w:sz w:val="21"/>
+        </w:rPr>
+        <w:t>not</w:t>
+      </w:r>
+      <w:r>
+        <w:rPr>
+          <w:rFonts w:ascii="Calibri" w:hAnsi="Calibri"/>
+          <w:b w:val="0"/>
+          <w:color w:val="000000"/>
+          <w:sz w:val="21"/>
+        </w:rPr>
+        <w:t xml:space="preserve"> an official Nutanix product or documentation set, is </w:t>
+      </w:r>
+      <w:r>
+        <w:rPr>
+          <w:rFonts w:ascii="Calibri" w:hAnsi="Calibri"/>
+          <w:b/>
+          <w:color w:val="000000"/>
+          <w:sz w:val="21"/>
+        </w:rPr>
+        <w:t>not</w:t>
+      </w:r>
+      <w:r>
+        <w:rPr>
+          <w:rFonts w:ascii="Calibri" w:hAnsi="Calibri"/>
+          <w:b w:val="0"/>
+          <w:color w:val="000000"/>
+          <w:sz w:val="21"/>
+        </w:rPr>
+        <w:t xml:space="preserve"> created, reviewed, or distributed by Nutanix, Inc., and is </w:t>
+      </w:r>
+      <w:r>
+        <w:rPr>
+          <w:rFonts w:ascii="Calibri" w:hAnsi="Calibri"/>
+          <w:b/>
+          <w:color w:val="000000"/>
+          <w:sz w:val="21"/>
+        </w:rPr>
+        <w:t>not</w:t>
+      </w:r>
+      <w:r>
+        <w:rPr>
+          <w:rFonts w:ascii="Calibri" w:hAnsi="Calibri"/>
+          <w:b w:val="0"/>
+          <w:color w:val="000000"/>
+          <w:sz w:val="21"/>
+        </w:rPr>
+        <w:t xml:space="preserve"> endorsed, certified, sponsored, or otherwise approved by Nutanix in any way.</w:t>
+      </w:r>
+    </w:p>
+    <w:p>
+      <w:pPr>
+        <w:spacing w:before="0" w:after="160" w:line="259" w:lineRule="auto"/>
+      </w:pPr>
+      <w:r>
+        <w:rPr>
+          <w:rFonts w:ascii="Calibri" w:hAnsi="Calibri"/>
+          <w:b w:val="0"/>
+          <w:color w:val="000000"/>
+          <w:sz w:val="21"/>
+        </w:rPr>
+        <w:t>"Nutanix," "AHV," "Prism," "Prism Central," "NCC," and any other Nutanix product, service, or documentation name referenced in this repository are trademarks or registered trademarks of Nutanix, Inc. in the United States and other countries. They are used here solely for descriptive, nominative purposes — to identify the systems this tool is designed to interoperate with — and no sponsorship, affiliation, or endorsement by Nutanix is implied or should be inferred.</w:t>
+      </w:r>
+    </w:p>
+    <w:p>
+      <w:pPr>
+        <w:spacing w:before="0" w:after="160" w:line="259" w:lineRule="auto"/>
+      </w:pPr>
+      <w:r>
+        <w:rPr>
+          <w:rFonts w:ascii="Calibri" w:hAnsi="Calibri"/>
+          <w:b w:val="0"/>
+          <w:color w:val="000000"/>
+          <w:sz w:val="21"/>
+        </w:rPr>
+        <w:t>References to the "Nutanix Security Guide," DISA STIG identifiers, control numbers, section names, or summaries are provided for cross-reference and convenience only. They are not a substitute for, and may not exactly match, Nutanix's own current official documentation, release notes, or support guidance — consult those directly for authoritative information.</w:t>
+      </w:r>
+    </w:p>
+    <w:p>
+      <w:pPr>
+        <w:spacing w:before="0" w:after="160" w:line="259" w:lineRule="auto"/>
+      </w:pPr>
+      <w:r>
+        <w:rPr>
+          <w:rFonts w:ascii="Calibri" w:hAnsi="Calibri"/>
+          <w:b w:val="0"/>
+          <w:color w:val="000000"/>
+          <w:sz w:val="21"/>
+        </w:rPr>
+        <w:t xml:space="preserve">This project is licensed under the terms in </w:t>
+      </w:r>
+      <w:hyperlink r:id="rId11">
+        <w:r>
+          <w:rPr>
+            <w:rFonts w:ascii="Calibri" w:hAnsi="Calibri"/>
+            <w:color w:val="0563C1"/>
+            <w:sz w:val="21"/>
+            <w:szCs w:val="21"/>
+            <w:u w:val="single"/>
+          </w:rPr>
+          <w:t>LICENSE</w:t>
+        </w:r>
+      </w:hyperlink>
+      <w:r>
+        <w:rPr>
+          <w:rFonts w:ascii="Calibri" w:hAnsi="Calibri"/>
+          <w:b w:val="0"/>
+          <w:color w:val="000000"/>
+          <w:sz w:val="21"/>
+        </w:rPr>
+        <w:t xml:space="preserve"> and is provided "as is," without warranty of any kind, by its contributors. Nutanix, Inc. is not a contributor to, and bears no responsibility for, this project.</w:t>
+      </w:r>
+    </w:p>
+    <w:p>
+      <w:pPr>
+        <w:spacing w:before="0" w:after="0" w:line="259" w:lineRule="auto"/>
+      </w:pPr>
+      <w:r>
+        <w:rPr>
+          <w:rFonts w:ascii="Calibri" w:hAnsi="Calibri"/>
+          <w:b w:val="0"/>
+          <w:color w:val="000000"/>
+          <w:sz w:val="21"/>
+        </w:rPr>
+        <w:t xml:space="preserve">For Nutanix's official products, documentation, and support channels, visit </w:t>
+      </w:r>
+      <w:hyperlink r:id="rId12">
+        <w:r>
+          <w:rPr>
+            <w:rFonts w:ascii="Calibri" w:hAnsi="Calibri"/>
+            <w:color w:val="0563C1"/>
+            <w:sz w:val="21"/>
+            <w:szCs w:val="21"/>
+            <w:u w:val="single"/>
+          </w:rPr>
+          <w:t>nutanix.com</w:t>
+        </w:r>
+      </w:hyperlink>
+      <w:r>
+        <w:rPr>
+          <w:rFonts w:ascii="Calibri" w:hAnsi="Calibri"/>
+          <w:b w:val="0"/>
+          <w:color w:val="000000"/>
+          <w:sz w:val="21"/>
+        </w:rPr>
+        <w:t xml:space="preserve"> and </w:t>
+      </w:r>
+      <w:hyperlink r:id="rId13">
+        <w:r>
+          <w:rPr>
+            <w:rFonts w:ascii="Calibri" w:hAnsi="Calibri"/>
+            <w:color w:val="0563C1"/>
+            <w:sz w:val="21"/>
+            <w:szCs w:val="21"/>
+            <w:u w:val="single"/>
+          </w:rPr>
+          <w:t>portal.nutanix.com</w:t>
+        </w:r>
+      </w:hyperlink>
+      <w:r>
+        <w:rPr>
+          <w:rFonts w:ascii="Calibri" w:hAnsi="Calibri"/>
+          <w:b w:val="0"/>
+          <w:color w:val="000000"/>
+          <w:sz w:val="21"/>
+        </w:rPr>
+        <w:t>.</w:t>
+      </w:r>
+      <w:r>
+        <w:br w:type="page"/>
+      </w:r>
+    </w:p>
     <w:p>
       <w:pPr>
         <w:spacing w:before="280" w:after="40"/>

</xml_diff>